<commit_message>
changes to reduce cost
</commit_message>
<xml_diff>
--- a/scripts/smoke_resume.docx
+++ b/scripts/smoke_resume.docx
@@ -1251,7 +1251,7 @@
           <w:ilvl w:val="0"/>
           <w:numId w:val="5"/>
         </w:numPr>
-        <w:spacing w:after="240" w:line="252" w:lineRule="auto"/>
+        <w:spacing w:line="252" w:lineRule="auto"/>
         <w:rPr>
           <w:rFonts w:ascii="Noto Sans Symbols" w:eastAsia="Noto Sans Symbols" w:hAnsi="Noto Sans Symbols" w:cs="Noto Sans Symbols"/>
         </w:rPr>
@@ -2019,7 +2019,7 @@
           <w:ilvl w:val="0"/>
           <w:numId w:val="4"/>
         </w:numPr>
-        <w:spacing w:after="240" w:line="252" w:lineRule="auto"/>
+        <w:spacing w:line="252" w:lineRule="auto"/>
         <w:rPr>
           <w:rFonts w:ascii="Noto Sans Symbols" w:eastAsia="Noto Sans Symbols" w:hAnsi="Noto Sans Symbols" w:cs="Noto Sans Symbols"/>
         </w:rPr>

</xml_diff>